<commit_message>
Agregar diagrama de clases y casos de uso, sincronizar documentación de despliegue
</commit_message>
<xml_diff>
--- a/docs/CuartaPala_Documentacion_Tecnica.docx
+++ b/docs/CuartaPala_Documentacion_Tecnica.docx
@@ -263,7 +263,7 @@
           <w:sz w:val="24"/>
           <w:szCs w:val="24"/>
         </w:rPr>
-        <w:t xml:space="preserve">3.  Modelo de datos</w:t>
+        <w:t xml:space="preserve">3.  Diagrama de clases</w:t>
       </w:r>
       <w:r>
         <w:rPr>
@@ -293,7 +293,7 @@
           <w:sz w:val="24"/>
           <w:szCs w:val="24"/>
         </w:rPr>
-        <w:t xml:space="preserve">4.  API REST</w:t>
+        <w:t xml:space="preserve">4.  Casos de uso</w:t>
       </w:r>
       <w:r>
         <w:rPr>
@@ -304,7 +304,7 @@
           <w:sz w:val="24"/>
           <w:szCs w:val="24"/>
         </w:rPr>
-        <w:t xml:space="preserve">	8</w:t>
+        <w:t xml:space="preserve">	7</w:t>
       </w:r>
     </w:p>
     <w:p>
@@ -323,7 +323,7 @@
           <w:sz w:val="24"/>
           <w:szCs w:val="24"/>
         </w:rPr>
-        <w:t xml:space="preserve">5.  Instalación y ejecución</w:t>
+        <w:t xml:space="preserve">5.  Modelo de datos</w:t>
       </w:r>
       <w:r>
         <w:rPr>
@@ -334,7 +334,7 @@
           <w:sz w:val="24"/>
           <w:szCs w:val="24"/>
         </w:rPr>
-        <w:t xml:space="preserve">	10</w:t>
+        <w:t xml:space="preserve">	9</w:t>
       </w:r>
     </w:p>
     <w:p>
@@ -353,7 +353,7 @@
           <w:sz w:val="24"/>
           <w:szCs w:val="24"/>
         </w:rPr>
-        <w:t xml:space="preserve">6.  Revisión de calidad y correcciones aplicadas</w:t>
+        <w:t xml:space="preserve">6.  API REST</w:t>
       </w:r>
       <w:r>
         <w:rPr>
@@ -364,7 +364,7 @@
           <w:sz w:val="24"/>
           <w:szCs w:val="24"/>
         </w:rPr>
-        <w:t xml:space="preserve">	12</w:t>
+        <w:t xml:space="preserve">	11</w:t>
       </w:r>
     </w:p>
     <w:p>
@@ -383,7 +383,7 @@
           <w:sz w:val="24"/>
           <w:szCs w:val="24"/>
         </w:rPr>
-        <w:t xml:space="preserve">7.  Conclusión</w:t>
+        <w:t xml:space="preserve">7.  Instalación y ejecución</w:t>
       </w:r>
       <w:r>
         <w:rPr>
@@ -394,7 +394,67 @@
           <w:sz w:val="24"/>
           <w:szCs w:val="24"/>
         </w:rPr>
-        <w:t xml:space="preserve">	14</w:t>
+        <w:t xml:space="preserve">	13</w:t>
+      </w:r>
+    </w:p>
+    <w:p>
+      <w:pPr>
+        <w:tabs>
+          <w:tab w:val="right" w:pos="9350" w:leader="dot"/>
+        </w:tabs>
+        <w:spacing w:after="160"/>
+      </w:pPr>
+      <w:r>
+        <w:rPr>
+          <w:rFonts w:ascii="Calibri" w:cs="Calibri" w:eastAsia="Calibri" w:hAnsi="Calibri"/>
+          <w:b/>
+          <w:bCs/>
+          <w:color w:val="10182B"/>
+          <w:sz w:val="24"/>
+          <w:szCs w:val="24"/>
+        </w:rPr>
+        <w:t xml:space="preserve">8.  Revisión de calidad y correcciones aplicadas</w:t>
+      </w:r>
+      <w:r>
+        <w:rPr>
+          <w:rFonts w:ascii="Calibri" w:cs="Calibri" w:eastAsia="Calibri" w:hAnsi="Calibri"/>
+          <w:b/>
+          <w:bCs/>
+          <w:color w:val="10182B"/>
+          <w:sz w:val="24"/>
+          <w:szCs w:val="24"/>
+        </w:rPr>
+        <w:t xml:space="preserve">	16</w:t>
+      </w:r>
+    </w:p>
+    <w:p>
+      <w:pPr>
+        <w:tabs>
+          <w:tab w:val="right" w:pos="9350" w:leader="dot"/>
+        </w:tabs>
+        <w:spacing w:after="160"/>
+      </w:pPr>
+      <w:r>
+        <w:rPr>
+          <w:rFonts w:ascii="Calibri" w:cs="Calibri" w:eastAsia="Calibri" w:hAnsi="Calibri"/>
+          <w:b/>
+          <w:bCs/>
+          <w:color w:val="10182B"/>
+          <w:sz w:val="24"/>
+          <w:szCs w:val="24"/>
+        </w:rPr>
+        <w:t xml:space="preserve">9.  Conclusión</w:t>
+      </w:r>
+      <w:r>
+        <w:rPr>
+          <w:rFonts w:ascii="Calibri" w:cs="Calibri" w:eastAsia="Calibri" w:hAnsi="Calibri"/>
+          <w:b/>
+          <w:bCs/>
+          <w:color w:val="10182B"/>
+          <w:sz w:val="24"/>
+          <w:szCs w:val="24"/>
+        </w:rPr>
+        <w:t xml:space="preserve">	18</w:t>
       </w:r>
     </w:p>
     <w:p>
@@ -1441,7 +1501,7 @@
           <w:bCs/>
           <w:color w:val="10182B"/>
         </w:rPr>
-        <w:t xml:space="preserve">3. Modelo de datos</w:t>
+        <w:t xml:space="preserve">3. Diagrama de clases</w:t>
       </w:r>
     </w:p>
     <w:p>
@@ -1454,7 +1514,7 @@
           <w:sz w:val="22"/>
           <w:szCs w:val="22"/>
         </w:rPr>
-        <w:t xml:space="preserve">El esquema de base de datos se genera automáticamente a partir de las entidades JPA (ddl-auto: update) — no requiere scripts SQL manuales.</w:t>
+        <w:t xml:space="preserve">El diagrama siguiente representa el modelo de dominio orientado a objetos del backend: las clases de entidad (JPA), sus atributos y las relaciones entre ellas. Es el mismo modelo que Hibernate traduce automáticamente al esquema relacional descrito en la sección 5.</w:t>
       </w:r>
     </w:p>
     <w:p>
@@ -1465,7 +1525,7 @@
       <w:r>
         <w:drawing>
           <wp:inline distT="0" distB="0" distL="0" distR="0">
-            <wp:extent cx="4572000" cy="2990850"/>
+            <wp:extent cx="4762500" cy="3152775"/>
             <wp:effectExtent t="0" r="0" b="0" l="0"/>
             <wp:docPr id="1" name="" descr="" title=""/>
             <wp:cNvGraphicFramePr>
@@ -1490,6 +1550,932 @@
                   <pic:spPr bwMode="auto">
                     <a:xfrm>
                       <a:off x="0" y="0"/>
+                      <a:ext cx="4762500" cy="3152775"/>
+                    </a:xfrm>
+                    <a:prstGeom prst="rect">
+                      <a:avLst/>
+                    </a:prstGeom>
+                  </pic:spPr>
+                </pic:pic>
+              </a:graphicData>
+            </a:graphic>
+          </wp:inline>
+        </w:drawing>
+      </w:r>
+    </w:p>
+    <w:p>
+      <w:pPr>
+        <w:spacing w:after="180" w:line="300"/>
+      </w:pPr>
+      <w:r>
+        <w:rPr>
+          <w:rFonts w:ascii="Calibri" w:cs="Calibri" w:eastAsia="Calibri" w:hAnsi="Calibri"/>
+          <w:sz w:val="22"/>
+          <w:szCs w:val="22"/>
+        </w:rPr>
+        <w:t xml:space="preserve">Usuario se relaciona con Partido a través de la asociación “organiza” (un usuario puede organizar muchos partidos) y con Inscripcion a través de “realiza” (un usuario puede tener muchas inscripciones, a distintos partidos). Partido se relaciona con Inscripcion mediante “recibe”. El atributo estado de Inscripcion toma valores del enumerado EstadoInscripcion, que modela el ciclo de vida de una solicitud de ingreso a un partido.</w:t>
+      </w:r>
+    </w:p>
+    <w:p>
+      <w:r>
+        <w:br w:type="page"/>
+      </w:r>
+    </w:p>
+    <w:p>
+      <w:pPr>
+        <w:pStyle w:val="Heading1"/>
+        <w:spacing w:after="240" w:before="480"/>
+      </w:pPr>
+      <w:r>
+        <w:rPr>
+          <w:rFonts w:ascii="Calibri" w:cs="Calibri" w:eastAsia="Calibri" w:hAnsi="Calibri"/>
+          <w:b/>
+          <w:bCs/>
+          <w:color w:val="10182B"/>
+        </w:rPr>
+        <w:t xml:space="preserve">4. Casos de uso</w:t>
+      </w:r>
+    </w:p>
+    <w:p>
+      <w:pPr>
+        <w:spacing w:after="180" w:line="300"/>
+      </w:pPr>
+      <w:r>
+        <w:rPr>
+          <w:rFonts w:ascii="Calibri" w:cs="Calibri" w:eastAsia="Calibri" w:hAnsi="Calibri"/>
+          <w:sz w:val="22"/>
+          <w:szCs w:val="22"/>
+        </w:rPr>
+        <w:t xml:space="preserve">Existe un único tipo de actor, Usuario: la aplicación no distingue roles fijos de “organizador” y “jugador” a nivel de cuenta — cualquier usuario autenticado puede crear un partido (y así ser su organizador) o solicitar sumarse a uno creado por otro (y así ser jugador). Explorar y filtrar partidos es el único caso de uso accesible sin autenticación; el resto requiere haber iniciado sesión.</w:t>
+      </w:r>
+    </w:p>
+    <w:p>
+      <w:pPr>
+        <w:spacing w:after="200" w:before="200"/>
+        <w:jc w:val="center"/>
+      </w:pPr>
+      <w:r>
+        <w:drawing>
+          <wp:inline distT="0" distB="0" distL="0" distR="0">
+            <wp:extent cx="4572000" cy="4124325"/>
+            <wp:effectExtent t="0" r="0" b="0" l="0"/>
+            <wp:docPr id="1" name="" descr="" title=""/>
+            <wp:cNvGraphicFramePr>
+              <a:graphicFrameLocks xmlns:a="http://schemas.openxmlformats.org/drawingml/2006/main" noChangeAspect="1"/>
+            </wp:cNvGraphicFramePr>
+            <a:graphic xmlns:a="http://schemas.openxmlformats.org/drawingml/2006/main">
+              <a:graphicData uri="http://schemas.openxmlformats.org/drawingml/2006/picture">
+                <pic:pic xmlns:pic="http://schemas.openxmlformats.org/drawingml/2006/picture">
+                  <pic:nvPicPr>
+                    <pic:cNvPr id="0" name="" descr=""/>
+                    <pic:cNvPicPr>
+                      <a:picLocks noChangeAspect="1" noChangeArrowheads="1"/>
+                    </pic:cNvPicPr>
+                  </pic:nvPicPr>
+                  <pic:blipFill>
+                    <a:blip r:embed="rId10" cstate="none"/>
+                    <a:srcRect/>
+                    <a:stretch>
+                      <a:fillRect/>
+                    </a:stretch>
+                  </pic:blipFill>
+                  <pic:spPr bwMode="auto">
+                    <a:xfrm>
+                      <a:off x="0" y="0"/>
+                      <a:ext cx="4572000" cy="4124325"/>
+                    </a:xfrm>
+                    <a:prstGeom prst="rect">
+                      <a:avLst/>
+                    </a:prstGeom>
+                  </pic:spPr>
+                </pic:pic>
+              </a:graphicData>
+            </a:graphic>
+          </wp:inline>
+        </w:drawing>
+      </w:r>
+    </w:p>
+    <w:p>
+      <w:pPr>
+        <w:pStyle w:val="Heading2"/>
+        <w:spacing w:after="160" w:before="320"/>
+      </w:pPr>
+      <w:r>
+        <w:rPr>
+          <w:rFonts w:ascii="Calibri" w:cs="Calibri" w:eastAsia="Calibri" w:hAnsi="Calibri"/>
+          <w:b/>
+          <w:bCs/>
+          <w:color w:val="10182B"/>
+        </w:rPr>
+        <w:t xml:space="preserve">4.1 Descripción de los casos de uso principales</w:t>
+      </w:r>
+    </w:p>
+    <w:tbl>
+      <w:tblPr>
+        <w:tblW w:type="dxa" w:w="9350"/>
+        <w:tblBorders>
+          <w:top w:val="single" w:color="D9DEE8" w:sz="4"/>
+          <w:left w:val="single" w:color="D9DEE8" w:sz="4"/>
+          <w:bottom w:val="single" w:color="D9DEE8" w:sz="4"/>
+          <w:right w:val="single" w:color="D9DEE8" w:sz="4"/>
+          <w:insideH w:val="single" w:color="D9DEE8" w:sz="4"/>
+          <w:insideV w:val="single" w:color="D9DEE8" w:sz="4"/>
+        </w:tblBorders>
+      </w:tblPr>
+      <w:tblGrid>
+        <w:gridCol w:w="2650"/>
+        <w:gridCol w:w="4900"/>
+        <w:gridCol w:w="1800"/>
+      </w:tblGrid>
+      <w:tr>
+        <w:trPr>
+          <w:tblHeader/>
+        </w:trPr>
+        <w:tc>
+          <w:tcPr>
+            <w:tcW w:type="dxa" w:w="2650"/>
+            <w:shd w:fill="10182B" w:val="clear"/>
+            <w:tcMar>
+              <w:top w:type="dxa" w:w="100"/>
+              <w:left w:type="dxa" w:w="120"/>
+              <w:bottom w:type="dxa" w:w="100"/>
+              <w:right w:type="dxa" w:w="120"/>
+            </w:tcMar>
+            <w:vAlign w:val="center"/>
+          </w:tcPr>
+          <w:p>
+            <w:r>
+              <w:rPr>
+                <w:rFonts w:ascii="Calibri" w:cs="Calibri" w:eastAsia="Calibri" w:hAnsi="Calibri"/>
+                <w:b/>
+                <w:bCs/>
+                <w:color w:val="FFFFFF"/>
+                <w:sz w:val="20"/>
+                <w:szCs w:val="20"/>
+              </w:rPr>
+              <w:t xml:space="preserve">Caso de uso</w:t>
+            </w:r>
+          </w:p>
+        </w:tc>
+        <w:tc>
+          <w:tcPr>
+            <w:tcW w:type="dxa" w:w="4900"/>
+            <w:shd w:fill="10182B" w:val="clear"/>
+            <w:tcMar>
+              <w:top w:type="dxa" w:w="100"/>
+              <w:left w:type="dxa" w:w="120"/>
+              <w:bottom w:type="dxa" w:w="100"/>
+              <w:right w:type="dxa" w:w="120"/>
+            </w:tcMar>
+            <w:vAlign w:val="center"/>
+          </w:tcPr>
+          <w:p>
+            <w:r>
+              <w:rPr>
+                <w:rFonts w:ascii="Calibri" w:cs="Calibri" w:eastAsia="Calibri" w:hAnsi="Calibri"/>
+                <w:b/>
+                <w:bCs/>
+                <w:color w:val="FFFFFF"/>
+                <w:sz w:val="20"/>
+                <w:szCs w:val="20"/>
+              </w:rPr>
+              <w:t xml:space="preserve">Descripción</w:t>
+            </w:r>
+          </w:p>
+        </w:tc>
+        <w:tc>
+          <w:tcPr>
+            <w:tcW w:type="dxa" w:w="1800"/>
+            <w:shd w:fill="10182B" w:val="clear"/>
+            <w:tcMar>
+              <w:top w:type="dxa" w:w="100"/>
+              <w:left w:type="dxa" w:w="120"/>
+              <w:bottom w:type="dxa" w:w="100"/>
+              <w:right w:type="dxa" w:w="120"/>
+            </w:tcMar>
+            <w:vAlign w:val="center"/>
+          </w:tcPr>
+          <w:p>
+            <w:r>
+              <w:rPr>
+                <w:rFonts w:ascii="Calibri" w:cs="Calibri" w:eastAsia="Calibri" w:hAnsi="Calibri"/>
+                <w:b/>
+                <w:bCs/>
+                <w:color w:val="FFFFFF"/>
+                <w:sz w:val="20"/>
+                <w:szCs w:val="20"/>
+              </w:rPr>
+              <w:t xml:space="preserve">Precondición</w:t>
+            </w:r>
+          </w:p>
+        </w:tc>
+      </w:tr>
+      <w:tr>
+        <w:tc>
+          <w:tcPr>
+            <w:tcW w:type="dxa" w:w="2650"/>
+            <w:tcMar>
+              <w:top w:type="dxa" w:w="90"/>
+              <w:left w:type="dxa" w:w="120"/>
+              <w:bottom w:type="dxa" w:w="90"/>
+              <w:right w:type="dxa" w:w="120"/>
+            </w:tcMar>
+            <w:vAlign w:val="center"/>
+          </w:tcPr>
+          <w:p>
+            <w:r>
+              <w:rPr>
+                <w:rFonts w:ascii="Calibri" w:cs="Calibri" w:eastAsia="Calibri" w:hAnsi="Calibri"/>
+                <w:color w:val="000000"/>
+                <w:sz w:val="20"/>
+                <w:szCs w:val="20"/>
+              </w:rPr>
+              <w:t xml:space="preserve">Registrarse</w:t>
+            </w:r>
+          </w:p>
+        </w:tc>
+        <w:tc>
+          <w:tcPr>
+            <w:tcW w:type="dxa" w:w="4900"/>
+            <w:tcMar>
+              <w:top w:type="dxa" w:w="90"/>
+              <w:left w:type="dxa" w:w="120"/>
+              <w:bottom w:type="dxa" w:w="90"/>
+              <w:right w:type="dxa" w:w="120"/>
+            </w:tcMar>
+            <w:vAlign w:val="center"/>
+          </w:tcPr>
+          <w:p>
+            <w:r>
+              <w:rPr>
+                <w:rFonts w:ascii="Calibri" w:cs="Calibri" w:eastAsia="Calibri" w:hAnsi="Calibri"/>
+                <w:color w:val="000000"/>
+                <w:sz w:val="20"/>
+                <w:szCs w:val="20"/>
+              </w:rPr>
+              <w:t xml:space="preserve">Crear una cuenta nueva con nombre, email, teléfono, nivel de juego y contraseña.</w:t>
+            </w:r>
+          </w:p>
+        </w:tc>
+        <w:tc>
+          <w:tcPr>
+            <w:tcW w:type="dxa" w:w="1800"/>
+            <w:tcMar>
+              <w:top w:type="dxa" w:w="90"/>
+              <w:left w:type="dxa" w:w="120"/>
+              <w:bottom w:type="dxa" w:w="90"/>
+              <w:right w:type="dxa" w:w="120"/>
+            </w:tcMar>
+            <w:vAlign w:val="center"/>
+          </w:tcPr>
+          <w:p>
+            <w:r>
+              <w:rPr>
+                <w:rFonts w:ascii="Calibri" w:cs="Calibri" w:eastAsia="Calibri" w:hAnsi="Calibri"/>
+                <w:color w:val="000000"/>
+                <w:sz w:val="20"/>
+                <w:szCs w:val="20"/>
+              </w:rPr>
+              <w:t xml:space="preserve">No tener cuenta con ese email.</w:t>
+            </w:r>
+          </w:p>
+        </w:tc>
+      </w:tr>
+      <w:tr>
+        <w:tc>
+          <w:tcPr>
+            <w:tcW w:type="dxa" w:w="2650"/>
+            <w:tcMar>
+              <w:top w:type="dxa" w:w="90"/>
+              <w:left w:type="dxa" w:w="120"/>
+              <w:bottom w:type="dxa" w:w="90"/>
+              <w:right w:type="dxa" w:w="120"/>
+            </w:tcMar>
+            <w:vAlign w:val="center"/>
+          </w:tcPr>
+          <w:p>
+            <w:r>
+              <w:rPr>
+                <w:rFonts w:ascii="Calibri" w:cs="Calibri" w:eastAsia="Calibri" w:hAnsi="Calibri"/>
+                <w:color w:val="000000"/>
+                <w:sz w:val="20"/>
+                <w:szCs w:val="20"/>
+              </w:rPr>
+              <w:t xml:space="preserve">Iniciar sesión</w:t>
+            </w:r>
+          </w:p>
+        </w:tc>
+        <w:tc>
+          <w:tcPr>
+            <w:tcW w:type="dxa" w:w="4900"/>
+            <w:tcMar>
+              <w:top w:type="dxa" w:w="90"/>
+              <w:left w:type="dxa" w:w="120"/>
+              <w:bottom w:type="dxa" w:w="90"/>
+              <w:right w:type="dxa" w:w="120"/>
+            </w:tcMar>
+            <w:vAlign w:val="center"/>
+          </w:tcPr>
+          <w:p>
+            <w:r>
+              <w:rPr>
+                <w:rFonts w:ascii="Calibri" w:cs="Calibri" w:eastAsia="Calibri" w:hAnsi="Calibri"/>
+                <w:color w:val="000000"/>
+                <w:sz w:val="20"/>
+                <w:szCs w:val="20"/>
+              </w:rPr>
+              <w:t xml:space="preserve">Autenticarse con email y contraseña para obtener un token JWT.</w:t>
+            </w:r>
+          </w:p>
+        </w:tc>
+        <w:tc>
+          <w:tcPr>
+            <w:tcW w:type="dxa" w:w="1800"/>
+            <w:tcMar>
+              <w:top w:type="dxa" w:w="90"/>
+              <w:left w:type="dxa" w:w="120"/>
+              <w:bottom w:type="dxa" w:w="90"/>
+              <w:right w:type="dxa" w:w="120"/>
+            </w:tcMar>
+            <w:vAlign w:val="center"/>
+          </w:tcPr>
+          <w:p>
+            <w:r>
+              <w:rPr>
+                <w:rFonts w:ascii="Calibri" w:cs="Calibri" w:eastAsia="Calibri" w:hAnsi="Calibri"/>
+                <w:color w:val="000000"/>
+                <w:sz w:val="20"/>
+                <w:szCs w:val="20"/>
+              </w:rPr>
+              <w:t xml:space="preserve">Tener una cuenta creada.</w:t>
+            </w:r>
+          </w:p>
+        </w:tc>
+      </w:tr>
+      <w:tr>
+        <w:tc>
+          <w:tcPr>
+            <w:tcW w:type="dxa" w:w="2650"/>
+            <w:tcMar>
+              <w:top w:type="dxa" w:w="90"/>
+              <w:left w:type="dxa" w:w="120"/>
+              <w:bottom w:type="dxa" w:w="90"/>
+              <w:right w:type="dxa" w:w="120"/>
+            </w:tcMar>
+            <w:vAlign w:val="center"/>
+          </w:tcPr>
+          <w:p>
+            <w:r>
+              <w:rPr>
+                <w:rFonts w:ascii="Calibri" w:cs="Calibri" w:eastAsia="Calibri" w:hAnsi="Calibri"/>
+                <w:color w:val="000000"/>
+                <w:sz w:val="20"/>
+                <w:szCs w:val="20"/>
+              </w:rPr>
+              <w:t xml:space="preserve">Explorar y filtrar partidos</w:t>
+            </w:r>
+          </w:p>
+        </w:tc>
+        <w:tc>
+          <w:tcPr>
+            <w:tcW w:type="dxa" w:w="4900"/>
+            <w:tcMar>
+              <w:top w:type="dxa" w:w="90"/>
+              <w:left w:type="dxa" w:w="120"/>
+              <w:bottom w:type="dxa" w:w="90"/>
+              <w:right w:type="dxa" w:w="120"/>
+            </w:tcMar>
+            <w:vAlign w:val="center"/>
+          </w:tcPr>
+          <w:p>
+            <w:r>
+              <w:rPr>
+                <w:rFonts w:ascii="Calibri" w:cs="Calibri" w:eastAsia="Calibri" w:hAnsi="Calibri"/>
+                <w:color w:val="000000"/>
+                <w:sz w:val="20"/>
+                <w:szCs w:val="20"/>
+              </w:rPr>
+              <w:t xml:space="preserve">Ver el listado de partidos disponibles, filtrando por zona, fecha, nivel, género o cercanía.</w:t>
+            </w:r>
+          </w:p>
+        </w:tc>
+        <w:tc>
+          <w:tcPr>
+            <w:tcW w:type="dxa" w:w="1800"/>
+            <w:tcMar>
+              <w:top w:type="dxa" w:w="90"/>
+              <w:left w:type="dxa" w:w="120"/>
+              <w:bottom w:type="dxa" w:w="90"/>
+              <w:right w:type="dxa" w:w="120"/>
+            </w:tcMar>
+            <w:vAlign w:val="center"/>
+          </w:tcPr>
+          <w:p>
+            <w:r>
+              <w:rPr>
+                <w:rFonts w:ascii="Calibri" w:cs="Calibri" w:eastAsia="Calibri" w:hAnsi="Calibri"/>
+                <w:color w:val="000000"/>
+                <w:sz w:val="20"/>
+                <w:szCs w:val="20"/>
+              </w:rPr>
+              <w:t xml:space="preserve">Ninguna (acceso público).</w:t>
+            </w:r>
+          </w:p>
+        </w:tc>
+      </w:tr>
+      <w:tr>
+        <w:tc>
+          <w:tcPr>
+            <w:tcW w:type="dxa" w:w="2650"/>
+            <w:tcMar>
+              <w:top w:type="dxa" w:w="90"/>
+              <w:left w:type="dxa" w:w="120"/>
+              <w:bottom w:type="dxa" w:w="90"/>
+              <w:right w:type="dxa" w:w="120"/>
+            </w:tcMar>
+            <w:vAlign w:val="center"/>
+          </w:tcPr>
+          <w:p>
+            <w:r>
+              <w:rPr>
+                <w:rFonts w:ascii="Calibri" w:cs="Calibri" w:eastAsia="Calibri" w:hAnsi="Calibri"/>
+                <w:color w:val="000000"/>
+                <w:sz w:val="20"/>
+                <w:szCs w:val="20"/>
+              </w:rPr>
+              <w:t xml:space="preserve">Crear partido</w:t>
+            </w:r>
+          </w:p>
+        </w:tc>
+        <w:tc>
+          <w:tcPr>
+            <w:tcW w:type="dxa" w:w="4900"/>
+            <w:tcMar>
+              <w:top w:type="dxa" w:w="90"/>
+              <w:left w:type="dxa" w:w="120"/>
+              <w:bottom w:type="dxa" w:w="90"/>
+              <w:right w:type="dxa" w:w="120"/>
+            </w:tcMar>
+            <w:vAlign w:val="center"/>
+          </w:tcPr>
+          <w:p>
+            <w:r>
+              <w:rPr>
+                <w:rFonts w:ascii="Calibri" w:cs="Calibri" w:eastAsia="Calibri" w:hAnsi="Calibri"/>
+                <w:color w:val="000000"/>
+                <w:sz w:val="20"/>
+                <w:szCs w:val="20"/>
+              </w:rPr>
+              <w:t xml:space="preserve">Publicar un partido nuevo indicando cancha, zona, fecha, hora, nivel, género, cupos y precio.</w:t>
+            </w:r>
+          </w:p>
+        </w:tc>
+        <w:tc>
+          <w:tcPr>
+            <w:tcW w:type="dxa" w:w="1800"/>
+            <w:tcMar>
+              <w:top w:type="dxa" w:w="90"/>
+              <w:left w:type="dxa" w:w="120"/>
+              <w:bottom w:type="dxa" w:w="90"/>
+              <w:right w:type="dxa" w:w="120"/>
+            </w:tcMar>
+            <w:vAlign w:val="center"/>
+          </w:tcPr>
+          <w:p>
+            <w:r>
+              <w:rPr>
+                <w:rFonts w:ascii="Calibri" w:cs="Calibri" w:eastAsia="Calibri" w:hAnsi="Calibri"/>
+                <w:color w:val="000000"/>
+                <w:sz w:val="20"/>
+                <w:szCs w:val="20"/>
+              </w:rPr>
+              <w:t xml:space="preserve">Sesión iniciada.</w:t>
+            </w:r>
+          </w:p>
+        </w:tc>
+      </w:tr>
+      <w:tr>
+        <w:tc>
+          <w:tcPr>
+            <w:tcW w:type="dxa" w:w="2650"/>
+            <w:tcMar>
+              <w:top w:type="dxa" w:w="90"/>
+              <w:left w:type="dxa" w:w="120"/>
+              <w:bottom w:type="dxa" w:w="90"/>
+              <w:right w:type="dxa" w:w="120"/>
+            </w:tcMar>
+            <w:vAlign w:val="center"/>
+          </w:tcPr>
+          <w:p>
+            <w:r>
+              <w:rPr>
+                <w:rFonts w:ascii="Calibri" w:cs="Calibri" w:eastAsia="Calibri" w:hAnsi="Calibri"/>
+                <w:color w:val="000000"/>
+                <w:sz w:val="20"/>
+                <w:szCs w:val="20"/>
+              </w:rPr>
+              <w:t xml:space="preserve">Solicitar unirse a un partido</w:t>
+            </w:r>
+          </w:p>
+        </w:tc>
+        <w:tc>
+          <w:tcPr>
+            <w:tcW w:type="dxa" w:w="4900"/>
+            <w:tcMar>
+              <w:top w:type="dxa" w:w="90"/>
+              <w:left w:type="dxa" w:w="120"/>
+              <w:bottom w:type="dxa" w:w="90"/>
+              <w:right w:type="dxa" w:w="120"/>
+            </w:tcMar>
+            <w:vAlign w:val="center"/>
+          </w:tcPr>
+          <w:p>
+            <w:r>
+              <w:rPr>
+                <w:rFonts w:ascii="Calibri" w:cs="Calibri" w:eastAsia="Calibri" w:hAnsi="Calibri"/>
+                <w:color w:val="000000"/>
+                <w:sz w:val="20"/>
+                <w:szCs w:val="20"/>
+              </w:rPr>
+              <w:t xml:space="preserve">Pedir un cupo en un partido publicado por otro usuario.</w:t>
+            </w:r>
+          </w:p>
+        </w:tc>
+        <w:tc>
+          <w:tcPr>
+            <w:tcW w:type="dxa" w:w="1800"/>
+            <w:tcMar>
+              <w:top w:type="dxa" w:w="90"/>
+              <w:left w:type="dxa" w:w="120"/>
+              <w:bottom w:type="dxa" w:w="90"/>
+              <w:right w:type="dxa" w:w="120"/>
+            </w:tcMar>
+            <w:vAlign w:val="center"/>
+          </w:tcPr>
+          <w:p>
+            <w:r>
+              <w:rPr>
+                <w:rFonts w:ascii="Calibri" w:cs="Calibri" w:eastAsia="Calibri" w:hAnsi="Calibri"/>
+                <w:color w:val="000000"/>
+                <w:sz w:val="20"/>
+                <w:szCs w:val="20"/>
+              </w:rPr>
+              <w:t xml:space="preserve">Sesión iniciada; el partido no debe estar lleno.</w:t>
+            </w:r>
+          </w:p>
+        </w:tc>
+      </w:tr>
+      <w:tr>
+        <w:tc>
+          <w:tcPr>
+            <w:tcW w:type="dxa" w:w="2650"/>
+            <w:tcMar>
+              <w:top w:type="dxa" w:w="90"/>
+              <w:left w:type="dxa" w:w="120"/>
+              <w:bottom w:type="dxa" w:w="90"/>
+              <w:right w:type="dxa" w:w="120"/>
+            </w:tcMar>
+            <w:vAlign w:val="center"/>
+          </w:tcPr>
+          <w:p>
+            <w:r>
+              <w:rPr>
+                <w:rFonts w:ascii="Calibri" w:cs="Calibri" w:eastAsia="Calibri" w:hAnsi="Calibri"/>
+                <w:color w:val="000000"/>
+                <w:sz w:val="20"/>
+                <w:szCs w:val="20"/>
+              </w:rPr>
+              <w:t xml:space="preserve">Gestionar solicitudes de ingreso</w:t>
+            </w:r>
+          </w:p>
+        </w:tc>
+        <w:tc>
+          <w:tcPr>
+            <w:tcW w:type="dxa" w:w="4900"/>
+            <w:tcMar>
+              <w:top w:type="dxa" w:w="90"/>
+              <w:left w:type="dxa" w:w="120"/>
+              <w:bottom w:type="dxa" w:w="90"/>
+              <w:right w:type="dxa" w:w="120"/>
+            </w:tcMar>
+            <w:vAlign w:val="center"/>
+          </w:tcPr>
+          <w:p>
+            <w:r>
+              <w:rPr>
+                <w:rFonts w:ascii="Calibri" w:cs="Calibri" w:eastAsia="Calibri" w:hAnsi="Calibri"/>
+                <w:color w:val="000000"/>
+                <w:sz w:val="20"/>
+                <w:szCs w:val="20"/>
+              </w:rPr>
+              <w:t xml:space="preserve">Ver, aceptar o rechazar las solicitudes pendientes de un partido propio.</w:t>
+            </w:r>
+          </w:p>
+        </w:tc>
+        <w:tc>
+          <w:tcPr>
+            <w:tcW w:type="dxa" w:w="1800"/>
+            <w:tcMar>
+              <w:top w:type="dxa" w:w="90"/>
+              <w:left w:type="dxa" w:w="120"/>
+              <w:bottom w:type="dxa" w:w="90"/>
+              <w:right w:type="dxa" w:w="120"/>
+            </w:tcMar>
+            <w:vAlign w:val="center"/>
+          </w:tcPr>
+          <w:p>
+            <w:r>
+              <w:rPr>
+                <w:rFonts w:ascii="Calibri" w:cs="Calibri" w:eastAsia="Calibri" w:hAnsi="Calibri"/>
+                <w:color w:val="000000"/>
+                <w:sz w:val="20"/>
+                <w:szCs w:val="20"/>
+              </w:rPr>
+              <w:t xml:space="preserve">Sesión iniciada; ser el organizador del partido.</w:t>
+            </w:r>
+          </w:p>
+        </w:tc>
+      </w:tr>
+      <w:tr>
+        <w:tc>
+          <w:tcPr>
+            <w:tcW w:type="dxa" w:w="2650"/>
+            <w:tcMar>
+              <w:top w:type="dxa" w:w="90"/>
+              <w:left w:type="dxa" w:w="120"/>
+              <w:bottom w:type="dxa" w:w="90"/>
+              <w:right w:type="dxa" w:w="120"/>
+            </w:tcMar>
+            <w:vAlign w:val="center"/>
+          </w:tcPr>
+          <w:p>
+            <w:r>
+              <w:rPr>
+                <w:rFonts w:ascii="Calibri" w:cs="Calibri" w:eastAsia="Calibri" w:hAnsi="Calibri"/>
+                <w:color w:val="000000"/>
+                <w:sz w:val="20"/>
+                <w:szCs w:val="20"/>
+              </w:rPr>
+              <w:t xml:space="preserve">Ver Mis Partidos</w:t>
+            </w:r>
+          </w:p>
+        </w:tc>
+        <w:tc>
+          <w:tcPr>
+            <w:tcW w:type="dxa" w:w="4900"/>
+            <w:tcMar>
+              <w:top w:type="dxa" w:w="90"/>
+              <w:left w:type="dxa" w:w="120"/>
+              <w:bottom w:type="dxa" w:w="90"/>
+              <w:right w:type="dxa" w:w="120"/>
+            </w:tcMar>
+            <w:vAlign w:val="center"/>
+          </w:tcPr>
+          <w:p>
+            <w:r>
+              <w:rPr>
+                <w:rFonts w:ascii="Calibri" w:cs="Calibri" w:eastAsia="Calibri" w:hAnsi="Calibri"/>
+                <w:color w:val="000000"/>
+                <w:sz w:val="20"/>
+                <w:szCs w:val="20"/>
+              </w:rPr>
+              <w:t xml:space="preserve">Ver los partidos creados y aquellos a los que el usuario se unió.</w:t>
+            </w:r>
+          </w:p>
+        </w:tc>
+        <w:tc>
+          <w:tcPr>
+            <w:tcW w:type="dxa" w:w="1800"/>
+            <w:tcMar>
+              <w:top w:type="dxa" w:w="90"/>
+              <w:left w:type="dxa" w:w="120"/>
+              <w:bottom w:type="dxa" w:w="90"/>
+              <w:right w:type="dxa" w:w="120"/>
+            </w:tcMar>
+            <w:vAlign w:val="center"/>
+          </w:tcPr>
+          <w:p>
+            <w:r>
+              <w:rPr>
+                <w:rFonts w:ascii="Calibri" w:cs="Calibri" w:eastAsia="Calibri" w:hAnsi="Calibri"/>
+                <w:color w:val="000000"/>
+                <w:sz w:val="20"/>
+                <w:szCs w:val="20"/>
+              </w:rPr>
+              <w:t xml:space="preserve">Sesión iniciada.</w:t>
+            </w:r>
+          </w:p>
+        </w:tc>
+      </w:tr>
+      <w:tr>
+        <w:tc>
+          <w:tcPr>
+            <w:tcW w:type="dxa" w:w="2650"/>
+            <w:tcMar>
+              <w:top w:type="dxa" w:w="90"/>
+              <w:left w:type="dxa" w:w="120"/>
+              <w:bottom w:type="dxa" w:w="90"/>
+              <w:right w:type="dxa" w:w="120"/>
+            </w:tcMar>
+            <w:vAlign w:val="center"/>
+          </w:tcPr>
+          <w:p>
+            <w:r>
+              <w:rPr>
+                <w:rFonts w:ascii="Calibri" w:cs="Calibri" w:eastAsia="Calibri" w:hAnsi="Calibri"/>
+                <w:color w:val="000000"/>
+                <w:sz w:val="20"/>
+                <w:szCs w:val="20"/>
+              </w:rPr>
+              <w:t xml:space="preserve">Contactar organizador por WhatsApp</w:t>
+            </w:r>
+          </w:p>
+        </w:tc>
+        <w:tc>
+          <w:tcPr>
+            <w:tcW w:type="dxa" w:w="4900"/>
+            <w:tcMar>
+              <w:top w:type="dxa" w:w="90"/>
+              <w:left w:type="dxa" w:w="120"/>
+              <w:bottom w:type="dxa" w:w="90"/>
+              <w:right w:type="dxa" w:w="120"/>
+            </w:tcMar>
+            <w:vAlign w:val="center"/>
+          </w:tcPr>
+          <w:p>
+            <w:r>
+              <w:rPr>
+                <w:rFonts w:ascii="Calibri" w:cs="Calibri" w:eastAsia="Calibri" w:hAnsi="Calibri"/>
+                <w:color w:val="000000"/>
+                <w:sz w:val="20"/>
+                <w:szCs w:val="20"/>
+              </w:rPr>
+              <w:t xml:space="preserve">Abrir un chat de WhatsApp con el organizador de un partido confirmado.</w:t>
+            </w:r>
+          </w:p>
+        </w:tc>
+        <w:tc>
+          <w:tcPr>
+            <w:tcW w:type="dxa" w:w="1800"/>
+            <w:tcMar>
+              <w:top w:type="dxa" w:w="90"/>
+              <w:left w:type="dxa" w:w="120"/>
+              <w:bottom w:type="dxa" w:w="90"/>
+              <w:right w:type="dxa" w:w="120"/>
+            </w:tcMar>
+            <w:vAlign w:val="center"/>
+          </w:tcPr>
+          <w:p>
+            <w:r>
+              <w:rPr>
+                <w:rFonts w:ascii="Calibri" w:cs="Calibri" w:eastAsia="Calibri" w:hAnsi="Calibri"/>
+                <w:color w:val="000000"/>
+                <w:sz w:val="20"/>
+                <w:szCs w:val="20"/>
+              </w:rPr>
+              <w:t xml:space="preserve">Tener una inscripción confirmada o ser el organizador.</w:t>
+            </w:r>
+          </w:p>
+        </w:tc>
+      </w:tr>
+      <w:tr>
+        <w:tc>
+          <w:tcPr>
+            <w:tcW w:type="dxa" w:w="2650"/>
+            <w:tcMar>
+              <w:top w:type="dxa" w:w="90"/>
+              <w:left w:type="dxa" w:w="120"/>
+              <w:bottom w:type="dxa" w:w="90"/>
+              <w:right w:type="dxa" w:w="120"/>
+            </w:tcMar>
+            <w:vAlign w:val="center"/>
+          </w:tcPr>
+          <w:p>
+            <w:r>
+              <w:rPr>
+                <w:rFonts w:ascii="Calibri" w:cs="Calibri" w:eastAsia="Calibri" w:hAnsi="Calibri"/>
+                <w:color w:val="000000"/>
+                <w:sz w:val="20"/>
+                <w:szCs w:val="20"/>
+              </w:rPr>
+              <w:t xml:space="preserve">Cerrar sesión</w:t>
+            </w:r>
+          </w:p>
+        </w:tc>
+        <w:tc>
+          <w:tcPr>
+            <w:tcW w:type="dxa" w:w="4900"/>
+            <w:tcMar>
+              <w:top w:type="dxa" w:w="90"/>
+              <w:left w:type="dxa" w:w="120"/>
+              <w:bottom w:type="dxa" w:w="90"/>
+              <w:right w:type="dxa" w:w="120"/>
+            </w:tcMar>
+            <w:vAlign w:val="center"/>
+          </w:tcPr>
+          <w:p>
+            <w:r>
+              <w:rPr>
+                <w:rFonts w:ascii="Calibri" w:cs="Calibri" w:eastAsia="Calibri" w:hAnsi="Calibri"/>
+                <w:color w:val="000000"/>
+                <w:sz w:val="20"/>
+                <w:szCs w:val="20"/>
+              </w:rPr>
+              <w:t xml:space="preserve">Invalidar la sesión activa en el cliente y volver al estado no autenticado.</w:t>
+            </w:r>
+          </w:p>
+        </w:tc>
+        <w:tc>
+          <w:tcPr>
+            <w:tcW w:type="dxa" w:w="1800"/>
+            <w:tcMar>
+              <w:top w:type="dxa" w:w="90"/>
+              <w:left w:type="dxa" w:w="120"/>
+              <w:bottom w:type="dxa" w:w="90"/>
+              <w:right w:type="dxa" w:w="120"/>
+            </w:tcMar>
+            <w:vAlign w:val="center"/>
+          </w:tcPr>
+          <w:p>
+            <w:r>
+              <w:rPr>
+                <w:rFonts w:ascii="Calibri" w:cs="Calibri" w:eastAsia="Calibri" w:hAnsi="Calibri"/>
+                <w:color w:val="000000"/>
+                <w:sz w:val="20"/>
+                <w:szCs w:val="20"/>
+              </w:rPr>
+              <w:t xml:space="preserve">Sesión iniciada.</w:t>
+            </w:r>
+          </w:p>
+        </w:tc>
+      </w:tr>
+    </w:tbl>
+    <w:p>
+      <w:r>
+        <w:br w:type="page"/>
+      </w:r>
+    </w:p>
+    <w:p>
+      <w:pPr>
+        <w:pStyle w:val="Heading1"/>
+        <w:spacing w:after="240" w:before="480"/>
+      </w:pPr>
+      <w:r>
+        <w:rPr>
+          <w:rFonts w:ascii="Calibri" w:cs="Calibri" w:eastAsia="Calibri" w:hAnsi="Calibri"/>
+          <w:b/>
+          <w:bCs/>
+          <w:color w:val="10182B"/>
+        </w:rPr>
+        <w:t xml:space="preserve">5. Modelo de datos</w:t>
+      </w:r>
+    </w:p>
+    <w:p>
+      <w:pPr>
+        <w:spacing w:after="180" w:line="300"/>
+      </w:pPr>
+      <w:r>
+        <w:rPr>
+          <w:rFonts w:ascii="Calibri" w:cs="Calibri" w:eastAsia="Calibri" w:hAnsi="Calibri"/>
+          <w:sz w:val="22"/>
+          <w:szCs w:val="22"/>
+        </w:rPr>
+        <w:t xml:space="preserve">El esquema de base de datos se genera automáticamente a partir de las entidades JPA (ddl-auto: update) — no requiere scripts SQL manuales.</w:t>
+      </w:r>
+    </w:p>
+    <w:p>
+      <w:pPr>
+        <w:spacing w:after="200" w:before="200"/>
+        <w:jc w:val="center"/>
+      </w:pPr>
+      <w:r>
+        <w:drawing>
+          <wp:inline distT="0" distB="0" distL="0" distR="0">
+            <wp:extent cx="4572000" cy="2990850"/>
+            <wp:effectExtent t="0" r="0" b="0" l="0"/>
+            <wp:docPr id="1" name="" descr="" title=""/>
+            <wp:cNvGraphicFramePr>
+              <a:graphicFrameLocks xmlns:a="http://schemas.openxmlformats.org/drawingml/2006/main" noChangeAspect="1"/>
+            </wp:cNvGraphicFramePr>
+            <a:graphic xmlns:a="http://schemas.openxmlformats.org/drawingml/2006/main">
+              <a:graphicData uri="http://schemas.openxmlformats.org/drawingml/2006/picture">
+                <pic:pic xmlns:pic="http://schemas.openxmlformats.org/drawingml/2006/picture">
+                  <pic:nvPicPr>
+                    <pic:cNvPr id="0" name="" descr=""/>
+                    <pic:cNvPicPr>
+                      <a:picLocks noChangeAspect="1" noChangeArrowheads="1"/>
+                    </pic:cNvPicPr>
+                  </pic:nvPicPr>
+                  <pic:blipFill>
+                    <a:blip r:embed="rId11" cstate="none"/>
+                    <a:srcRect/>
+                    <a:stretch>
+                      <a:fillRect/>
+                    </a:stretch>
+                  </pic:blipFill>
+                  <pic:spPr bwMode="auto">
+                    <a:xfrm>
+                      <a:off x="0" y="0"/>
                       <a:ext cx="4572000" cy="2990850"/>
                     </a:xfrm>
                     <a:prstGeom prst="rect">
@@ -1515,7 +2501,7 @@
           <w:bCs/>
           <w:color w:val="10182B"/>
         </w:rPr>
-        <w:t xml:space="preserve">3.1 Entidades</w:t>
+        <w:t xml:space="preserve">5.1 Entidades</w:t>
       </w:r>
     </w:p>
     <w:p>
@@ -1614,7 +2600,7 @@
           <w:bCs/>
           <w:color w:val="10182B"/>
         </w:rPr>
-        <w:t xml:space="preserve">3.2 Reglas de negocio relevantes</w:t>
+        <w:t xml:space="preserve">5.2 Reglas de negocio relevantes</w:t>
       </w:r>
     </w:p>
     <w:p>
@@ -1688,7 +2674,7 @@
           <w:bCs/>
           <w:color w:val="10182B"/>
         </w:rPr>
-        <w:t xml:space="preserve">4. API REST</w:t>
+        <w:t xml:space="preserve">6. API REST</w:t>
       </w:r>
     </w:p>
     <w:p>
@@ -1716,7 +2702,7 @@
           <w:bCs/>
           <w:color w:val="10182B"/>
         </w:rPr>
-        <w:t xml:space="preserve">4.1 Autenticación — /api/auth</w:t>
+        <w:t xml:space="preserve">6.1 Autenticación — /api/auth</w:t>
       </w:r>
     </w:p>
     <w:tbl>
@@ -2045,7 +3031,7 @@
           <w:bCs/>
           <w:color w:val="10182B"/>
         </w:rPr>
-        <w:t xml:space="preserve">4.2 Partidos — /api/partidos</w:t>
+        <w:t xml:space="preserve">6.2 Partidos — /api/partidos</w:t>
       </w:r>
     </w:p>
     <w:tbl>
@@ -2729,7 +3715,7 @@
           <w:bCs/>
           <w:color w:val="10182B"/>
         </w:rPr>
-        <w:t xml:space="preserve">4.3 Filtros disponibles en el listado</w:t>
+        <w:t xml:space="preserve">6.3 Filtros disponibles en el listado</w:t>
       </w:r>
     </w:p>
     <w:tbl>
@@ -3271,7 +4257,7 @@
           <w:bCs/>
           <w:color w:val="10182B"/>
         </w:rPr>
-        <w:t xml:space="preserve">4.4 Códigos de estado HTTP</w:t>
+        <w:t xml:space="preserve">6.4 Códigos de estado HTTP</w:t>
       </w:r>
     </w:p>
     <w:tbl>
@@ -3653,7 +4639,7 @@
           <w:bCs/>
           <w:color w:val="10182B"/>
         </w:rPr>
-        <w:t xml:space="preserve">5. Instalación y ejecución</w:t>
+        <w:t xml:space="preserve">7. Instalación y ejecución</w:t>
       </w:r>
     </w:p>
     <w:p>
@@ -3668,7 +4654,7 @@
           <w:bCs/>
           <w:color w:val="10182B"/>
         </w:rPr>
-        <w:t xml:space="preserve">5.1 Requisitos</w:t>
+        <w:t xml:space="preserve">7.1 Requisitos</w:t>
       </w:r>
     </w:p>
     <w:p>
@@ -3755,7 +4741,7 @@
           <w:bCs/>
           <w:color w:val="10182B"/>
         </w:rPr>
-        <w:t xml:space="preserve">5.2 Backend</w:t>
+        <w:t xml:space="preserve">7.2 Backend</w:t>
       </w:r>
     </w:p>
     <w:p>
@@ -3933,7 +4919,7 @@
           <w:bCs/>
           <w:color w:val="10182B"/>
         </w:rPr>
-        <w:t xml:space="preserve">5.3 Frontend</w:t>
+        <w:t xml:space="preserve">7.3 Frontend</w:t>
       </w:r>
     </w:p>
     <w:p>
@@ -4004,7 +4990,7 @@
           <w:sz w:val="22"/>
           <w:szCs w:val="22"/>
         </w:rPr>
-        <w:t xml:space="preserve">La URL del backend está fijada en Front/js/api.js (API_BASE_URL); si el backend corre en otro host/puerto hay que actualizar esa constante.</w:t>
+        <w:t xml:space="preserve">La URL del backend se resuelve automáticamente en Front/js/api.js: en localhost apunta a http://localhost:8080/api, y en cualquier otro dominio usa la constante BACKEND_URL (el backend desplegado en Render — ver sección 7.6).</w:t>
       </w:r>
     </w:p>
     <w:p>
@@ -4019,7 +5005,7 @@
           <w:bCs/>
           <w:color w:val="10182B"/>
         </w:rPr>
-        <w:t xml:space="preserve">5.4 Verificación funcional (smoke test)</w:t>
+        <w:t xml:space="preserve">7.4 Verificación funcional (smoke test)</w:t>
       </w:r>
     </w:p>
     <w:p>
@@ -4124,7 +5110,7 @@
           <w:bCs/>
           <w:color w:val="10182B"/>
         </w:rPr>
-        <w:t xml:space="preserve">5.5 Tests automatizados</w:t>
+        <w:t xml:space="preserve">7.5 Tests automatizados</w:t>
       </w:r>
     </w:p>
     <w:p>
@@ -4177,8 +5163,8 @@
     </w:p>
     <w:p>
       <w:pPr>
-        <w:pStyle w:val="Heading1"/>
-        <w:spacing w:after="240" w:before="480"/>
+        <w:pStyle w:val="Heading2"/>
+        <w:spacing w:after="160" w:before="320"/>
       </w:pPr>
       <w:r>
         <w:rPr>
@@ -4187,7 +5173,7 @@
           <w:bCs/>
           <w:color w:val="10182B"/>
         </w:rPr>
-        <w:t xml:space="preserve">6. Revisión de calidad y correcciones aplicadas</w:t>
+        <w:t xml:space="preserve">7.6 Despliegue a producción</w:t>
       </w:r>
     </w:p>
     <w:p>
@@ -4200,13 +5186,734 @@
           <w:sz w:val="22"/>
           <w:szCs w:val="22"/>
         </w:rPr>
-        <w:t xml:space="preserve">Antes de esta entrega se realizó una revisión completa del código (backend y frontend), verificando cada hallazgo contra el sistema real — levantando el backend y reproduciendo cada caso con peticiones HTTP reales y, para el flujo crítico, con clicks reales en la interfaz — en vez de basarse solo en la lectura del código. A continuación se resumen los problemas encontrados y las correcciones aplicadas.</w:t>
-      </w:r>
-    </w:p>
-    <w:p>
-      <w:pPr>
-        <w:pStyle w:val="Heading2"/>
-        <w:spacing w:after="160" w:before="320"/>
+        <w:t xml:space="preserve">El proyecto está desplegado con tres servicios gratuitos: Netlify para el frontend estático, Render para el backend Java (Docker) y Supabase para la base de datos PostgreSQL gestionada. Se descartaron Vercel y Railway para el backend, que no ofrecen procesos Java persistentes gratis de forma confiable.</w:t>
+      </w:r>
+    </w:p>
+    <w:tbl>
+      <w:tblPr>
+        <w:tblW w:type="dxa" w:w="9350"/>
+        <w:tblBorders>
+          <w:top w:val="single" w:color="D9DEE8" w:sz="4"/>
+          <w:left w:val="single" w:color="D9DEE8" w:sz="4"/>
+          <w:bottom w:val="single" w:color="D9DEE8" w:sz="4"/>
+          <w:right w:val="single" w:color="D9DEE8" w:sz="4"/>
+          <w:insideH w:val="single" w:color="D9DEE8" w:sz="4"/>
+          <w:insideV w:val="single" w:color="D9DEE8" w:sz="4"/>
+        </w:tblBorders>
+      </w:tblPr>
+      <w:tblGrid>
+        <w:gridCol w:w="1800"/>
+        <w:gridCol w:w="3200"/>
+        <w:gridCol w:w="4350"/>
+      </w:tblGrid>
+      <w:tr>
+        <w:trPr>
+          <w:tblHeader/>
+        </w:trPr>
+        <w:tc>
+          <w:tcPr>
+            <w:tcW w:type="dxa" w:w="1800"/>
+            <w:shd w:fill="10182B" w:val="clear"/>
+            <w:tcMar>
+              <w:top w:type="dxa" w:w="100"/>
+              <w:left w:type="dxa" w:w="120"/>
+              <w:bottom w:type="dxa" w:w="100"/>
+              <w:right w:type="dxa" w:w="120"/>
+            </w:tcMar>
+            <w:vAlign w:val="center"/>
+          </w:tcPr>
+          <w:p>
+            <w:r>
+              <w:rPr>
+                <w:rFonts w:ascii="Calibri" w:cs="Calibri" w:eastAsia="Calibri" w:hAnsi="Calibri"/>
+                <w:b/>
+                <w:bCs/>
+                <w:color w:val="FFFFFF"/>
+                <w:sz w:val="20"/>
+                <w:szCs w:val="20"/>
+              </w:rPr>
+              <w:t xml:space="preserve">Servicio</w:t>
+            </w:r>
+          </w:p>
+        </w:tc>
+        <w:tc>
+          <w:tcPr>
+            <w:tcW w:type="dxa" w:w="3200"/>
+            <w:shd w:fill="10182B" w:val="clear"/>
+            <w:tcMar>
+              <w:top w:type="dxa" w:w="100"/>
+              <w:left w:type="dxa" w:w="120"/>
+              <w:bottom w:type="dxa" w:w="100"/>
+              <w:right w:type="dxa" w:w="120"/>
+            </w:tcMar>
+            <w:vAlign w:val="center"/>
+          </w:tcPr>
+          <w:p>
+            <w:r>
+              <w:rPr>
+                <w:rFonts w:ascii="Calibri" w:cs="Calibri" w:eastAsia="Calibri" w:hAnsi="Calibri"/>
+                <w:b/>
+                <w:bCs/>
+                <w:color w:val="FFFFFF"/>
+                <w:sz w:val="20"/>
+                <w:szCs w:val="20"/>
+              </w:rPr>
+              <w:t xml:space="preserve">Rol</w:t>
+            </w:r>
+          </w:p>
+        </w:tc>
+        <w:tc>
+          <w:tcPr>
+            <w:tcW w:type="dxa" w:w="4350"/>
+            <w:shd w:fill="10182B" w:val="clear"/>
+            <w:tcMar>
+              <w:top w:type="dxa" w:w="100"/>
+              <w:left w:type="dxa" w:w="120"/>
+              <w:bottom w:type="dxa" w:w="100"/>
+              <w:right w:type="dxa" w:w="120"/>
+            </w:tcMar>
+            <w:vAlign w:val="center"/>
+          </w:tcPr>
+          <w:p>
+            <w:r>
+              <w:rPr>
+                <w:rFonts w:ascii="Calibri" w:cs="Calibri" w:eastAsia="Calibri" w:hAnsi="Calibri"/>
+                <w:b/>
+                <w:bCs/>
+                <w:color w:val="FFFFFF"/>
+                <w:sz w:val="20"/>
+                <w:szCs w:val="20"/>
+              </w:rPr>
+              <w:t xml:space="preserve">Particularidad del plan gratuito</w:t>
+            </w:r>
+          </w:p>
+        </w:tc>
+      </w:tr>
+      <w:tr>
+        <w:tc>
+          <w:tcPr>
+            <w:tcW w:type="dxa" w:w="1800"/>
+            <w:tcMar>
+              <w:top w:type="dxa" w:w="90"/>
+              <w:left w:type="dxa" w:w="120"/>
+              <w:bottom w:type="dxa" w:w="90"/>
+              <w:right w:type="dxa" w:w="120"/>
+            </w:tcMar>
+            <w:vAlign w:val="center"/>
+          </w:tcPr>
+          <w:p>
+            <w:r>
+              <w:rPr>
+                <w:rFonts w:ascii="Calibri" w:cs="Calibri" w:eastAsia="Calibri" w:hAnsi="Calibri"/>
+                <w:color w:val="000000"/>
+                <w:sz w:val="20"/>
+                <w:szCs w:val="20"/>
+              </w:rPr>
+              <w:t xml:space="preserve">Netlify</w:t>
+            </w:r>
+          </w:p>
+        </w:tc>
+        <w:tc>
+          <w:tcPr>
+            <w:tcW w:type="dxa" w:w="3200"/>
+            <w:tcMar>
+              <w:top w:type="dxa" w:w="90"/>
+              <w:left w:type="dxa" w:w="120"/>
+              <w:bottom w:type="dxa" w:w="90"/>
+              <w:right w:type="dxa" w:w="120"/>
+            </w:tcMar>
+            <w:vAlign w:val="center"/>
+          </w:tcPr>
+          <w:p>
+            <w:r>
+              <w:rPr>
+                <w:rFonts w:ascii="Calibri" w:cs="Calibri" w:eastAsia="Calibri" w:hAnsi="Calibri"/>
+                <w:color w:val="000000"/>
+                <w:sz w:val="20"/>
+                <w:szCs w:val="20"/>
+              </w:rPr>
+              <w:t xml:space="preserve">Hosting estático del frontend</w:t>
+            </w:r>
+          </w:p>
+        </w:tc>
+        <w:tc>
+          <w:tcPr>
+            <w:tcW w:type="dxa" w:w="4350"/>
+            <w:tcMar>
+              <w:top w:type="dxa" w:w="90"/>
+              <w:left w:type="dxa" w:w="120"/>
+              <w:bottom w:type="dxa" w:w="90"/>
+              <w:right w:type="dxa" w:w="120"/>
+            </w:tcMar>
+            <w:vAlign w:val="center"/>
+          </w:tcPr>
+          <w:p>
+            <w:r>
+              <w:rPr>
+                <w:rFonts w:ascii="Calibri" w:cs="Calibri" w:eastAsia="Calibri" w:hAnsi="Calibri"/>
+                <w:color w:val="000000"/>
+                <w:sz w:val="20"/>
+                <w:szCs w:val="20"/>
+              </w:rPr>
+              <w:t xml:space="preserve">Sin limitaciones relevantes para este proyecto.</w:t>
+            </w:r>
+          </w:p>
+        </w:tc>
+      </w:tr>
+      <w:tr>
+        <w:tc>
+          <w:tcPr>
+            <w:tcW w:type="dxa" w:w="1800"/>
+            <w:tcMar>
+              <w:top w:type="dxa" w:w="90"/>
+              <w:left w:type="dxa" w:w="120"/>
+              <w:bottom w:type="dxa" w:w="90"/>
+              <w:right w:type="dxa" w:w="120"/>
+            </w:tcMar>
+            <w:vAlign w:val="center"/>
+          </w:tcPr>
+          <w:p>
+            <w:r>
+              <w:rPr>
+                <w:rFonts w:ascii="Calibri" w:cs="Calibri" w:eastAsia="Calibri" w:hAnsi="Calibri"/>
+                <w:color w:val="000000"/>
+                <w:sz w:val="20"/>
+                <w:szCs w:val="20"/>
+              </w:rPr>
+              <w:t xml:space="preserve">Render</w:t>
+            </w:r>
+          </w:p>
+        </w:tc>
+        <w:tc>
+          <w:tcPr>
+            <w:tcW w:type="dxa" w:w="3200"/>
+            <w:tcMar>
+              <w:top w:type="dxa" w:w="90"/>
+              <w:left w:type="dxa" w:w="120"/>
+              <w:bottom w:type="dxa" w:w="90"/>
+              <w:right w:type="dxa" w:w="120"/>
+            </w:tcMar>
+            <w:vAlign w:val="center"/>
+          </w:tcPr>
+          <w:p>
+            <w:r>
+              <w:rPr>
+                <w:rFonts w:ascii="Calibri" w:cs="Calibri" w:eastAsia="Calibri" w:hAnsi="Calibri"/>
+                <w:color w:val="000000"/>
+                <w:sz w:val="20"/>
+                <w:szCs w:val="20"/>
+              </w:rPr>
+              <w:t xml:space="preserve">Backend Java (imagen Docker)</w:t>
+            </w:r>
+          </w:p>
+        </w:tc>
+        <w:tc>
+          <w:tcPr>
+            <w:tcW w:type="dxa" w:w="4350"/>
+            <w:tcMar>
+              <w:top w:type="dxa" w:w="90"/>
+              <w:left w:type="dxa" w:w="120"/>
+              <w:bottom w:type="dxa" w:w="90"/>
+              <w:right w:type="dxa" w:w="120"/>
+            </w:tcMar>
+            <w:vAlign w:val="center"/>
+          </w:tcPr>
+          <w:p>
+            <w:r>
+              <w:rPr>
+                <w:rFonts w:ascii="Calibri" w:cs="Calibri" w:eastAsia="Calibri" w:hAnsi="Calibri"/>
+                <w:color w:val="000000"/>
+                <w:sz w:val="20"/>
+                <w:szCs w:val="20"/>
+              </w:rPr>
+              <w:t xml:space="preserve">Se "duerme" tras ~15 min sin uso; la siguiente consulta tarda ~30-50s en responder mientras despierta.</w:t>
+            </w:r>
+          </w:p>
+        </w:tc>
+      </w:tr>
+      <w:tr>
+        <w:tc>
+          <w:tcPr>
+            <w:tcW w:type="dxa" w:w="1800"/>
+            <w:tcMar>
+              <w:top w:type="dxa" w:w="90"/>
+              <w:left w:type="dxa" w:w="120"/>
+              <w:bottom w:type="dxa" w:w="90"/>
+              <w:right w:type="dxa" w:w="120"/>
+            </w:tcMar>
+            <w:vAlign w:val="center"/>
+          </w:tcPr>
+          <w:p>
+            <w:r>
+              <w:rPr>
+                <w:rFonts w:ascii="Calibri" w:cs="Calibri" w:eastAsia="Calibri" w:hAnsi="Calibri"/>
+                <w:color w:val="000000"/>
+                <w:sz w:val="20"/>
+                <w:szCs w:val="20"/>
+              </w:rPr>
+              <w:t xml:space="preserve">Supabase</w:t>
+            </w:r>
+          </w:p>
+        </w:tc>
+        <w:tc>
+          <w:tcPr>
+            <w:tcW w:type="dxa" w:w="3200"/>
+            <w:tcMar>
+              <w:top w:type="dxa" w:w="90"/>
+              <w:left w:type="dxa" w:w="120"/>
+              <w:bottom w:type="dxa" w:w="90"/>
+              <w:right w:type="dxa" w:w="120"/>
+            </w:tcMar>
+            <w:vAlign w:val="center"/>
+          </w:tcPr>
+          <w:p>
+            <w:r>
+              <w:rPr>
+                <w:rFonts w:ascii="Calibri" w:cs="Calibri" w:eastAsia="Calibri" w:hAnsi="Calibri"/>
+                <w:color w:val="000000"/>
+                <w:sz w:val="20"/>
+                <w:szCs w:val="20"/>
+              </w:rPr>
+              <w:t xml:space="preserve">Base de datos PostgreSQL</w:t>
+            </w:r>
+          </w:p>
+        </w:tc>
+        <w:tc>
+          <w:tcPr>
+            <w:tcW w:type="dxa" w:w="4350"/>
+            <w:tcMar>
+              <w:top w:type="dxa" w:w="90"/>
+              <w:left w:type="dxa" w:w="120"/>
+              <w:bottom w:type="dxa" w:w="90"/>
+              <w:right w:type="dxa" w:w="120"/>
+            </w:tcMar>
+            <w:vAlign w:val="center"/>
+          </w:tcPr>
+          <w:p>
+            <w:r>
+              <w:rPr>
+                <w:rFonts w:ascii="Calibri" w:cs="Calibri" w:eastAsia="Calibri" w:hAnsi="Calibri"/>
+                <w:color w:val="000000"/>
+                <w:sz w:val="20"/>
+                <w:szCs w:val="20"/>
+              </w:rPr>
+              <w:t xml:space="preserve">500 MB; se pausa (no se borra) tras 1 semana sin actividad.</w:t>
+            </w:r>
+          </w:p>
+        </w:tc>
+      </w:tr>
+    </w:tbl>
+    <w:p>
+      <w:pPr>
+        <w:pStyle w:val="Heading3"/>
+        <w:spacing w:after="120" w:before="240"/>
+      </w:pPr>
+      <w:r>
+        <w:rPr>
+          <w:rFonts w:ascii="Calibri" w:cs="Calibri" w:eastAsia="Calibri" w:hAnsi="Calibri"/>
+          <w:b/>
+          <w:bCs/>
+          <w:color w:val="2A3550"/>
+        </w:rPr>
+        <w:t xml:space="preserve">Variables de entorno en Render</w:t>
+      </w:r>
+    </w:p>
+    <w:tbl>
+      <w:tblPr>
+        <w:tblW w:type="dxa" w:w="9350"/>
+        <w:tblBorders>
+          <w:top w:val="single" w:color="D9DEE8" w:sz="4"/>
+          <w:left w:val="single" w:color="D9DEE8" w:sz="4"/>
+          <w:bottom w:val="single" w:color="D9DEE8" w:sz="4"/>
+          <w:right w:val="single" w:color="D9DEE8" w:sz="4"/>
+          <w:insideH w:val="single" w:color="D9DEE8" w:sz="4"/>
+          <w:insideV w:val="single" w:color="D9DEE8" w:sz="4"/>
+        </w:tblBorders>
+      </w:tblPr>
+      <w:tblGrid>
+        <w:gridCol w:w="2600"/>
+        <w:gridCol w:w="6750"/>
+      </w:tblGrid>
+      <w:tr>
+        <w:trPr>
+          <w:tblHeader/>
+        </w:trPr>
+        <w:tc>
+          <w:tcPr>
+            <w:tcW w:type="dxa" w:w="2600"/>
+            <w:shd w:fill="10182B" w:val="clear"/>
+            <w:tcMar>
+              <w:top w:type="dxa" w:w="100"/>
+              <w:left w:type="dxa" w:w="120"/>
+              <w:bottom w:type="dxa" w:w="100"/>
+              <w:right w:type="dxa" w:w="120"/>
+            </w:tcMar>
+            <w:vAlign w:val="center"/>
+          </w:tcPr>
+          <w:p>
+            <w:r>
+              <w:rPr>
+                <w:rFonts w:ascii="Calibri" w:cs="Calibri" w:eastAsia="Calibri" w:hAnsi="Calibri"/>
+                <w:b/>
+                <w:bCs/>
+                <w:color w:val="FFFFFF"/>
+                <w:sz w:val="20"/>
+                <w:szCs w:val="20"/>
+              </w:rPr>
+              <w:t xml:space="preserve">Variable</w:t>
+            </w:r>
+          </w:p>
+        </w:tc>
+        <w:tc>
+          <w:tcPr>
+            <w:tcW w:type="dxa" w:w="6750"/>
+            <w:shd w:fill="10182B" w:val="clear"/>
+            <w:tcMar>
+              <w:top w:type="dxa" w:w="100"/>
+              <w:left w:type="dxa" w:w="120"/>
+              <w:bottom w:type="dxa" w:w="100"/>
+              <w:right w:type="dxa" w:w="120"/>
+            </w:tcMar>
+            <w:vAlign w:val="center"/>
+          </w:tcPr>
+          <w:p>
+            <w:r>
+              <w:rPr>
+                <w:rFonts w:ascii="Calibri" w:cs="Calibri" w:eastAsia="Calibri" w:hAnsi="Calibri"/>
+                <w:b/>
+                <w:bCs/>
+                <w:color w:val="FFFFFF"/>
+                <w:sz w:val="20"/>
+                <w:szCs w:val="20"/>
+              </w:rPr>
+              <w:t xml:space="preserve">Valor</w:t>
+            </w:r>
+          </w:p>
+        </w:tc>
+      </w:tr>
+      <w:tr>
+        <w:tc>
+          <w:tcPr>
+            <w:tcW w:type="dxa" w:w="2600"/>
+            <w:tcMar>
+              <w:top w:type="dxa" w:w="90"/>
+              <w:left w:type="dxa" w:w="120"/>
+              <w:bottom w:type="dxa" w:w="90"/>
+              <w:right w:type="dxa" w:w="120"/>
+            </w:tcMar>
+            <w:vAlign w:val="center"/>
+          </w:tcPr>
+          <w:p>
+            <w:r>
+              <w:rPr>
+                <w:rFonts w:ascii="Consolas" w:cs="Consolas" w:eastAsia="Consolas" w:hAnsi="Consolas"/>
+                <w:color w:val="1E2A44"/>
+                <w:sz w:val="18"/>
+                <w:szCs w:val="18"/>
+              </w:rPr>
+              <w:t xml:space="preserve">SPRING_PROFILES_ACTIVE</w:t>
+            </w:r>
+          </w:p>
+        </w:tc>
+        <w:tc>
+          <w:tcPr>
+            <w:tcW w:type="dxa" w:w="6750"/>
+            <w:tcMar>
+              <w:top w:type="dxa" w:w="90"/>
+              <w:left w:type="dxa" w:w="120"/>
+              <w:bottom w:type="dxa" w:w="90"/>
+              <w:right w:type="dxa" w:w="120"/>
+            </w:tcMar>
+            <w:vAlign w:val="center"/>
+          </w:tcPr>
+          <w:p>
+            <w:r>
+              <w:rPr>
+                <w:rFonts w:ascii="Calibri" w:cs="Calibri" w:eastAsia="Calibri" w:hAnsi="Calibri"/>
+                <w:color w:val="000000"/>
+                <w:sz w:val="20"/>
+                <w:szCs w:val="20"/>
+              </w:rPr>
+              <w:t xml:space="preserve">postgres</w:t>
+            </w:r>
+          </w:p>
+        </w:tc>
+      </w:tr>
+      <w:tr>
+        <w:tc>
+          <w:tcPr>
+            <w:tcW w:type="dxa" w:w="2600"/>
+            <w:tcMar>
+              <w:top w:type="dxa" w:w="90"/>
+              <w:left w:type="dxa" w:w="120"/>
+              <w:bottom w:type="dxa" w:w="90"/>
+              <w:right w:type="dxa" w:w="120"/>
+            </w:tcMar>
+            <w:vAlign w:val="center"/>
+          </w:tcPr>
+          <w:p>
+            <w:r>
+              <w:rPr>
+                <w:rFonts w:ascii="Consolas" w:cs="Consolas" w:eastAsia="Consolas" w:hAnsi="Consolas"/>
+                <w:color w:val="1E2A44"/>
+                <w:sz w:val="18"/>
+                <w:szCs w:val="18"/>
+              </w:rPr>
+              <w:t xml:space="preserve">DB_URL</w:t>
+            </w:r>
+          </w:p>
+        </w:tc>
+        <w:tc>
+          <w:tcPr>
+            <w:tcW w:type="dxa" w:w="6750"/>
+            <w:tcMar>
+              <w:top w:type="dxa" w:w="90"/>
+              <w:left w:type="dxa" w:w="120"/>
+              <w:bottom w:type="dxa" w:w="90"/>
+              <w:right w:type="dxa" w:w="120"/>
+            </w:tcMar>
+            <w:vAlign w:val="center"/>
+          </w:tcPr>
+          <w:p>
+            <w:r>
+              <w:rPr>
+                <w:rFonts w:ascii="Calibri" w:cs="Calibri" w:eastAsia="Calibri" w:hAnsi="Calibri"/>
+                <w:color w:val="000000"/>
+                <w:sz w:val="20"/>
+                <w:szCs w:val="20"/>
+              </w:rPr>
+              <w:t xml:space="preserve">jdbc:postgresql://&lt;host-de-supabase&gt;:5432/postgres</w:t>
+            </w:r>
+          </w:p>
+        </w:tc>
+      </w:tr>
+      <w:tr>
+        <w:tc>
+          <w:tcPr>
+            <w:tcW w:type="dxa" w:w="2600"/>
+            <w:tcMar>
+              <w:top w:type="dxa" w:w="90"/>
+              <w:left w:type="dxa" w:w="120"/>
+              <w:bottom w:type="dxa" w:w="90"/>
+              <w:right w:type="dxa" w:w="120"/>
+            </w:tcMar>
+            <w:vAlign w:val="center"/>
+          </w:tcPr>
+          <w:p>
+            <w:r>
+              <w:rPr>
+                <w:rFonts w:ascii="Consolas" w:cs="Consolas" w:eastAsia="Consolas" w:hAnsi="Consolas"/>
+                <w:color w:val="1E2A44"/>
+                <w:sz w:val="18"/>
+                <w:szCs w:val="18"/>
+              </w:rPr>
+              <w:t xml:space="preserve">DB_USERNAME</w:t>
+            </w:r>
+          </w:p>
+        </w:tc>
+        <w:tc>
+          <w:tcPr>
+            <w:tcW w:type="dxa" w:w="6750"/>
+            <w:tcMar>
+              <w:top w:type="dxa" w:w="90"/>
+              <w:left w:type="dxa" w:w="120"/>
+              <w:bottom w:type="dxa" w:w="90"/>
+              <w:right w:type="dxa" w:w="120"/>
+            </w:tcMar>
+            <w:vAlign w:val="center"/>
+          </w:tcPr>
+          <w:p>
+            <w:r>
+              <w:rPr>
+                <w:rFonts w:ascii="Calibri" w:cs="Calibri" w:eastAsia="Calibri" w:hAnsi="Calibri"/>
+                <w:color w:val="000000"/>
+                <w:sz w:val="20"/>
+                <w:szCs w:val="20"/>
+              </w:rPr>
+              <w:t xml:space="preserve">postgres.&lt;referencia-del-proyecto&gt; (usuario del connection pooler de Supabase)</w:t>
+            </w:r>
+          </w:p>
+        </w:tc>
+      </w:tr>
+      <w:tr>
+        <w:tc>
+          <w:tcPr>
+            <w:tcW w:type="dxa" w:w="2600"/>
+            <w:tcMar>
+              <w:top w:type="dxa" w:w="90"/>
+              <w:left w:type="dxa" w:w="120"/>
+              <w:bottom w:type="dxa" w:w="90"/>
+              <w:right w:type="dxa" w:w="120"/>
+            </w:tcMar>
+            <w:vAlign w:val="center"/>
+          </w:tcPr>
+          <w:p>
+            <w:r>
+              <w:rPr>
+                <w:rFonts w:ascii="Consolas" w:cs="Consolas" w:eastAsia="Consolas" w:hAnsi="Consolas"/>
+                <w:color w:val="1E2A44"/>
+                <w:sz w:val="18"/>
+                <w:szCs w:val="18"/>
+              </w:rPr>
+              <w:t xml:space="preserve">DB_PASSWORD</w:t>
+            </w:r>
+          </w:p>
+        </w:tc>
+        <w:tc>
+          <w:tcPr>
+            <w:tcW w:type="dxa" w:w="6750"/>
+            <w:tcMar>
+              <w:top w:type="dxa" w:w="90"/>
+              <w:left w:type="dxa" w:w="120"/>
+              <w:bottom w:type="dxa" w:w="90"/>
+              <w:right w:type="dxa" w:w="120"/>
+            </w:tcMar>
+            <w:vAlign w:val="center"/>
+          </w:tcPr>
+          <w:p>
+            <w:r>
+              <w:rPr>
+                <w:rFonts w:ascii="Calibri" w:cs="Calibri" w:eastAsia="Calibri" w:hAnsi="Calibri"/>
+                <w:color w:val="000000"/>
+                <w:sz w:val="20"/>
+                <w:szCs w:val="20"/>
+              </w:rPr>
+              <w:t xml:space="preserve">la contraseña definida al crear el proyecto en Supabase</w:t>
+            </w:r>
+          </w:p>
+        </w:tc>
+      </w:tr>
+      <w:tr>
+        <w:tc>
+          <w:tcPr>
+            <w:tcW w:type="dxa" w:w="2600"/>
+            <w:tcMar>
+              <w:top w:type="dxa" w:w="90"/>
+              <w:left w:type="dxa" w:w="120"/>
+              <w:bottom w:type="dxa" w:w="90"/>
+              <w:right w:type="dxa" w:w="120"/>
+            </w:tcMar>
+            <w:vAlign w:val="center"/>
+          </w:tcPr>
+          <w:p>
+            <w:r>
+              <w:rPr>
+                <w:rFonts w:ascii="Consolas" w:cs="Consolas" w:eastAsia="Consolas" w:hAnsi="Consolas"/>
+                <w:color w:val="1E2A44"/>
+                <w:sz w:val="18"/>
+                <w:szCs w:val="18"/>
+              </w:rPr>
+              <w:t xml:space="preserve">JWT_SECRET</w:t>
+            </w:r>
+          </w:p>
+        </w:tc>
+        <w:tc>
+          <w:tcPr>
+            <w:tcW w:type="dxa" w:w="6750"/>
+            <w:tcMar>
+              <w:top w:type="dxa" w:w="90"/>
+              <w:left w:type="dxa" w:w="120"/>
+              <w:bottom w:type="dxa" w:w="90"/>
+              <w:right w:type="dxa" w:w="120"/>
+            </w:tcMar>
+            <w:vAlign w:val="center"/>
+          </w:tcPr>
+          <w:p>
+            <w:r>
+              <w:rPr>
+                <w:rFonts w:ascii="Calibri" w:cs="Calibri" w:eastAsia="Calibri" w:hAnsi="Calibri"/>
+                <w:color w:val="000000"/>
+                <w:sz w:val="20"/>
+                <w:szCs w:val="20"/>
+              </w:rPr>
+              <w:t xml:space="preserve">una clave propia, larga y secreta (no la que trae el repositorio)</w:t>
+            </w:r>
+          </w:p>
+        </w:tc>
+      </w:tr>
+    </w:tbl>
+    <w:tbl>
+      <w:tblPr>
+        <w:tblW w:type="dxa" w:w="9350"/>
+        <w:tblBorders>
+          <w:top w:val="single" w:color="8FB300" w:sz="12"/>
+          <w:left w:val="single" w:color="D9DEE8" w:sz="4"/>
+          <w:bottom w:val="single" w:color="D9DEE8" w:sz="4"/>
+          <w:right w:val="single" w:color="D9DEE8" w:sz="4"/>
+          <w:insideH w:val="single" w:color="D9DEE8" w:sz="4"/>
+          <w:insideV w:val="single" w:color="D9DEE8" w:sz="4"/>
+        </w:tblBorders>
+      </w:tblPr>
+      <w:tblGrid>
+        <w:gridCol w:w="100"/>
+      </w:tblGrid>
+      <w:tr>
+        <w:tc>
+          <w:tcPr>
+            <w:shd w:fill="F1FFB8" w:val="clear"/>
+            <w:tcMar>
+              <w:top w:type="dxa" w:w="160"/>
+              <w:left w:type="dxa" w:w="200"/>
+              <w:bottom w:type="dxa" w:w="160"/>
+              <w:right w:type="dxa" w:w="200"/>
+            </w:tcMar>
+          </w:tcPr>
+          <w:p>
+            <w:pPr>
+              <w:spacing w:after="80"/>
+            </w:pPr>
+            <w:r>
+              <w:rPr>
+                <w:rFonts w:ascii="Calibri" w:cs="Calibri" w:eastAsia="Calibri" w:hAnsi="Calibri"/>
+                <w:b/>
+                <w:bCs/>
+                <w:color w:val="8FB300"/>
+                <w:sz w:val="21"/>
+                <w:szCs w:val="21"/>
+              </w:rPr>
+              <w:t xml:space="preserve">Importante en producción</w:t>
+            </w:r>
+          </w:p>
+          <w:p>
+            <w:r>
+              <w:rPr>
+                <w:rFonts w:ascii="Calibri" w:cs="Calibri" w:eastAsia="Calibri" w:hAnsi="Calibri"/>
+                <w:sz w:val="21"/>
+                <w:szCs w:val="21"/>
+              </w:rPr>
+              <w:t xml:space="preserve">El JWT_SECRET que trae el repositorio es solo para desarrollo local. En producción hay que definir uno propio vía variable de entorno — si alguien lo conoce puede firmar tokens válidos para cualquier usuario.</w:t>
+            </w:r>
+          </w:p>
+        </w:tc>
+      </w:tr>
+    </w:tbl>
+    <w:p>
+      <w:pPr>
+        <w:spacing w:after="100"/>
+      </w:pPr>
+    </w:p>
+    <w:p>
+      <w:pPr>
+        <w:spacing w:after="180" w:line="300"/>
+      </w:pPr>
+      <w:r>
+        <w:rPr>
+          <w:rFonts w:ascii="Calibri" w:cs="Calibri" w:eastAsia="Calibri" w:hAnsi="Calibri"/>
+          <w:sz w:val="22"/>
+          <w:szCs w:val="22"/>
+        </w:rPr>
+        <w:t xml:space="preserve">El backend expone la imagen a partir de Back/Dockerfile (build multi-stage: Maven compila el jar, un runtime liviano con solo el JRE lo ejecuta). Antes de desplegar el frontend hay que actualizar la constante BACKEND_URL en Front/js/api.js con la URL pública que asigna Render, y conectar el repositorio en Netlify — el archivo netlify.toml en la raíz ya indica que la carpeta a publicar es Front/. No hace falta tocar CorsConfig: el backend acepta pedidos desde cualquier origen.</w:t>
+      </w:r>
+    </w:p>
+    <w:p>
+      <w:r>
+        <w:br w:type="page"/>
+      </w:r>
+    </w:p>
+    <w:p>
+      <w:pPr>
+        <w:pStyle w:val="Heading1"/>
+        <w:spacing w:after="240" w:before="480"/>
       </w:pPr>
       <w:r>
         <w:rPr>
@@ -4215,7 +5922,35 @@
           <w:bCs/>
           <w:color w:val="10182B"/>
         </w:rPr>
-        <w:t xml:space="preserve">6.1 Problemas críticos corregidos</w:t>
+        <w:t xml:space="preserve">8. Revisión de calidad y correcciones aplicadas</w:t>
+      </w:r>
+    </w:p>
+    <w:p>
+      <w:pPr>
+        <w:spacing w:after="180" w:line="300"/>
+      </w:pPr>
+      <w:r>
+        <w:rPr>
+          <w:rFonts w:ascii="Calibri" w:cs="Calibri" w:eastAsia="Calibri" w:hAnsi="Calibri"/>
+          <w:sz w:val="22"/>
+          <w:szCs w:val="22"/>
+        </w:rPr>
+        <w:t xml:space="preserve">Antes de esta entrega se realizó una revisión completa del código (backend y frontend), verificando cada hallazgo contra el sistema real — levantando el backend y reproduciendo cada caso con peticiones HTTP reales y, para el flujo crítico, con clicks reales en la interfaz — en vez de basarse solo en la lectura del código. A continuación se resumen los problemas encontrados y las correcciones aplicadas.</w:t>
+      </w:r>
+    </w:p>
+    <w:p>
+      <w:pPr>
+        <w:pStyle w:val="Heading2"/>
+        <w:spacing w:after="160" w:before="320"/>
+      </w:pPr>
+      <w:r>
+        <w:rPr>
+          <w:rFonts w:ascii="Calibri" w:cs="Calibri" w:eastAsia="Calibri" w:hAnsi="Calibri"/>
+          <w:b/>
+          <w:bCs/>
+          <w:color w:val="10182B"/>
+        </w:rPr>
+        <w:t xml:space="preserve">8.1 Problemas críticos corregidos</w:t>
       </w:r>
     </w:p>
     <w:p>
@@ -4370,7 +6105,7 @@
           <w:bCs/>
           <w:color w:val="10182B"/>
         </w:rPr>
-        <w:t xml:space="preserve">6.2 Mejoras de configuración y robustez</w:t>
+        <w:t xml:space="preserve">8.2 Mejoras de configuración y robustez</w:t>
       </w:r>
     </w:p>
     <w:p>
@@ -4439,7 +6174,7 @@
           <w:bCs/>
           <w:color w:val="10182B"/>
         </w:rPr>
-        <w:t xml:space="preserve">6.3 Verificación</w:t>
+        <w:t xml:space="preserve">8.3 Verificación</w:t>
       </w:r>
     </w:p>
     <w:p>
@@ -4472,7 +6207,7 @@
           <w:bCs/>
           <w:color w:val="10182B"/>
         </w:rPr>
-        <w:t xml:space="preserve">7. Conclusión</w:t>
+        <w:t xml:space="preserve">9. Conclusión</w:t>
       </w:r>
     </w:p>
     <w:p>

</xml_diff>